<commit_message>
Plaqueta de sensado aparte, unida a la principal por J4
La guía paso a paso (md y Word), el diagrama de plaquetas, el índice, el README de diagramas, la
Guía del Bloque A y Componentes en placa describen ahora cinco plaquetas: la de sensado de la
botonera va aparte, con J4 (3,3 V, GND y GPIO 32, 33 y 34) y B1 doble por botón (un par de la
botonera y otro hacia NO y COM de su relé).

Co-Authored-By: Claude Opus 5.5 <noreply@anthropic.com>
Claude-Session: https://claude.ai/code/session_01QiY8ZZNAM9gwPKiqSkCaaj
</commit_message>
<xml_diff>
--- a/documentacion_proyecto/Guia_Conexion_y_Puesta_en_Marcha.docx
+++ b/documentacion_proyecto/Guia_Conexion_y_Puesta_en_Marcha.docx
@@ -66,7 +66,7 @@
           <w:sz w:val="21"/>
           <w:szCs w:val="21"/>
         </w:rPr>
-        <w:t xml:space="preserve">cuatro plaquetas</w:t>
+        <w:t xml:space="preserve">cinco plaquetas</w:t>
       </w:r>
       <w:r>
         <w:rPr>
@@ -904,7 +904,7 @@
           <w:sz w:val="21"/>
           <w:szCs w:val="21"/>
         </w:rPr>
-        <w:t xml:space="preserve">El gabinete lleva cuatro plaquetas de placa perforada, con las conexiones soldadas (la protoboard sirve para probar, pero la vibración del telar afloja sus contactos). Cada cable entra a su plaqueta por un </w:t>
+        <w:t xml:space="preserve">El gabinete lleva cinco plaquetas con las conexiones soldadas: cuatro de placa perforada y la del sensado de la botonera, impresa (la protoboard sirve para probar, pero la vibración del telar afloja sus contactos). Cada cable entra a su plaqueta por un </w:t>
       </w:r>
       <w:r>
         <w:rPr>
@@ -972,7 +972,7 @@
           <wp:inline distT="0" distB="0" distL="0" distR="0">
             <wp:extent cx="6096000" cy="4829175"/>
             <wp:effectExtent t="0" r="0" b="0" l="0"/>
-            <wp:docPr id="1" name="plaquetas_y_cableado.png" descr="Las cuatro plaquetas del gabinete, sus conectores y los cables que van al telar (diagramas/hardware/plaquetas_y_cableado.png)." title="Las cuatro plaquetas del gabinete, sus conectores y los cables que van al telar (diagramas/hardware/plaquetas_y_cableado.png)."/>
+            <wp:docPr id="1" name="plaquetas_y_cableado.png" descr="Las cinco plaquetas del gabinete, sus conectores y los cables que van al telar (diagramas/hardware/plaquetas_y_cableado.png)." title="Las cinco plaquetas del gabinete, sus conectores y los cables que van al telar (diagramas/hardware/plaquetas_y_cableado.png)."/>
             <wp:cNvGraphicFramePr>
               <a:graphicFrameLocks xmlns:a="http://schemas.openxmlformats.org/drawingml/2006/main" noChangeAspect="1"/>
             </wp:cNvGraphicFramePr>
@@ -1022,7 +1022,7 @@
           <w:sz w:val="17"/>
           <w:szCs w:val="17"/>
         </w:rPr>
-        <w:t xml:space="preserve">Las cuatro plaquetas del gabinete, sus conectores y los cables que van al telar (diagramas/hardware/plaquetas_y_cableado.png).</w:t>
+        <w:t xml:space="preserve">Las cinco plaquetas del gabinete, sus conectores y los cables que van al telar (diagramas/hardware/plaquetas_y_cableado.png).</w:t>
       </w:r>
     </w:p>
     <w:tbl>
@@ -1754,6 +1754,143 @@
               <w:bottom w:val="single" w:color="CDD8E0" w:sz="4"/>
               <w:right w:val="single" w:color="CDD8E0" w:sz="4"/>
             </w:tcBorders>
+            <w:shd w:fill="F4F7FA" w:color="auto" w:val="clear"/>
+            <w:tcMar>
+              <w:top w:type="dxa" w:w="70"/>
+              <w:left w:type="dxa" w:w="110"/>
+              <w:bottom w:type="dxa" w:w="70"/>
+              <w:right w:type="dxa" w:w="110"/>
+            </w:tcMar>
+          </w:tcPr>
+          <w:p>
+            <w:pPr>
+              <w:keepNext w:val="false"/>
+              <w:keepLines/>
+              <w:spacing w:after="0" w:line="260"/>
+            </w:pPr>
+            <w:r>
+              <w:rPr>
+                <w:rFonts w:ascii="IBM Plex Sans" w:cs="IBM Plex Sans" w:eastAsia="IBM Plex Sans" w:hAnsi="IBM Plex Sans"/>
+                <w:sz w:val="19"/>
+                <w:szCs w:val="19"/>
+              </w:rPr>
+              <w:t xml:space="preserve">J4</w:t>
+            </w:r>
+          </w:p>
+        </w:tc>
+        <w:tc>
+          <w:tcPr>
+            <w:tcW w:type="dxa" w:w="3100"/>
+            <w:tcBorders>
+              <w:top w:val="single" w:color="CDD8E0" w:sz="4"/>
+              <w:left w:val="single" w:color="CDD8E0" w:sz="4"/>
+              <w:bottom w:val="single" w:color="CDD8E0" w:sz="4"/>
+              <w:right w:val="single" w:color="CDD8E0" w:sz="4"/>
+            </w:tcBorders>
+            <w:shd w:fill="F4F7FA" w:color="auto" w:val="clear"/>
+            <w:tcMar>
+              <w:top w:type="dxa" w:w="70"/>
+              <w:left w:type="dxa" w:w="110"/>
+              <w:bottom w:type="dxa" w:w="70"/>
+              <w:right w:type="dxa" w:w="110"/>
+            </w:tcMar>
+          </w:tcPr>
+          <w:p>
+            <w:pPr>
+              <w:keepNext w:val="false"/>
+              <w:keepLines/>
+              <w:spacing w:after="0" w:line="260"/>
+            </w:pPr>
+            <w:r>
+              <w:rPr>
+                <w:rFonts w:ascii="IBM Plex Sans" w:cs="IBM Plex Sans" w:eastAsia="IBM Plex Sans" w:hAnsi="IBM Plex Sans"/>
+                <w:sz w:val="19"/>
+                <w:szCs w:val="19"/>
+              </w:rPr>
+              <w:t xml:space="preserve">Plaqueta 2 → plaqueta 5 (sensado)</w:t>
+            </w:r>
+          </w:p>
+        </w:tc>
+        <w:tc>
+          <w:tcPr>
+            <w:tcW w:type="dxa" w:w="3638"/>
+            <w:tcBorders>
+              <w:top w:val="single" w:color="CDD8E0" w:sz="4"/>
+              <w:left w:val="single" w:color="CDD8E0" w:sz="4"/>
+              <w:bottom w:val="single" w:color="CDD8E0" w:sz="4"/>
+              <w:right w:val="single" w:color="CDD8E0" w:sz="4"/>
+            </w:tcBorders>
+            <w:shd w:fill="F4F7FA" w:color="auto" w:val="clear"/>
+            <w:tcMar>
+              <w:top w:type="dxa" w:w="70"/>
+              <w:left w:type="dxa" w:w="110"/>
+              <w:bottom w:type="dxa" w:w="70"/>
+              <w:right w:type="dxa" w:w="110"/>
+            </w:tcMar>
+          </w:tcPr>
+          <w:p>
+            <w:pPr>
+              <w:keepNext w:val="false"/>
+              <w:keepLines/>
+              <w:spacing w:after="0" w:line="260"/>
+            </w:pPr>
+            <w:r>
+              <w:rPr>
+                <w:rFonts w:ascii="IBM Plex Sans" w:cs="IBM Plex Sans" w:eastAsia="IBM Plex Sans" w:hAnsi="IBM Plex Sans"/>
+                <w:sz w:val="19"/>
+                <w:szCs w:val="19"/>
+              </w:rPr>
+              <w:t xml:space="preserve">3,3 V, GND, GPIO 32, 33 y 34</w:t>
+            </w:r>
+          </w:p>
+        </w:tc>
+        <w:tc>
+          <w:tcPr>
+            <w:tcW w:type="dxa" w:w="2000"/>
+            <w:tcBorders>
+              <w:top w:val="single" w:color="CDD8E0" w:sz="4"/>
+              <w:left w:val="single" w:color="CDD8E0" w:sz="4"/>
+              <w:bottom w:val="single" w:color="CDD8E0" w:sz="4"/>
+              <w:right w:val="single" w:color="CDD8E0" w:sz="4"/>
+            </w:tcBorders>
+            <w:shd w:fill="F4F7FA" w:color="auto" w:val="clear"/>
+            <w:tcMar>
+              <w:top w:type="dxa" w:w="70"/>
+              <w:left w:type="dxa" w:w="110"/>
+              <w:bottom w:type="dxa" w:w="70"/>
+              <w:right w:type="dxa" w:w="110"/>
+            </w:tcMar>
+          </w:tcPr>
+          <w:p>
+            <w:pPr>
+              <w:keepNext w:val="false"/>
+              <w:keepLines/>
+              <w:spacing w:after="0" w:line="260"/>
+            </w:pPr>
+            <w:r>
+              <w:rPr>
+                <w:rFonts w:ascii="IBM Plex Sans" w:cs="IBM Plex Sans" w:eastAsia="IBM Plex Sans" w:hAnsi="IBM Plex Sans"/>
+                <w:sz w:val="19"/>
+                <w:szCs w:val="19"/>
+              </w:rPr>
+              <w:t xml:space="preserve">Tira de pines</w:t>
+            </w:r>
+          </w:p>
+        </w:tc>
+      </w:tr>
+      <w:tr>
+        <w:trPr>
+          <w:cantSplit/>
+        </w:trPr>
+        <w:tc>
+          <w:tcPr>
+            <w:tcW w:type="dxa" w:w="900"/>
+            <w:tcBorders>
+              <w:top w:val="single" w:color="CDD8E0" w:sz="4"/>
+              <w:left w:val="single" w:color="CDD8E0" w:sz="4"/>
+              <w:bottom w:val="single" w:color="CDD8E0" w:sz="4"/>
+              <w:right w:val="single" w:color="CDD8E0" w:sz="4"/>
+            </w:tcBorders>
             <w:shd w:fill="FFFFFF" w:color="auto" w:val="clear"/>
             <w:tcMar>
               <w:top w:type="dxa" w:w="70"/>
@@ -1807,7 +1944,7 @@
                 <w:sz w:val="19"/>
                 <w:szCs w:val="19"/>
               </w:rPr>
-              <w:t xml:space="preserve">Botonera del telar → plaquetas 3 y 2</w:t>
+              <w:t xml:space="preserve">Botonera del telar → plaqueta 5 (sensado), y de ahí a la 3 (relés)</w:t>
             </w:r>
           </w:p>
         </w:tc>
@@ -1873,7 +2010,7 @@
                 <w:sz w:val="19"/>
                 <w:szCs w:val="19"/>
               </w:rPr>
-              <w:t xml:space="preserve">Bornera de tornillo</w:t>
+              <w:t xml:space="preserve">Bornera de tornillo doble por botón: un par de la botonera y otro a NO y COM de su relé</w:t>
             </w:r>
           </w:p>
         </w:tc>
@@ -2215,7 +2352,7 @@
                 <w:sz w:val="20"/>
                 <w:szCs w:val="20"/>
               </w:rPr>
-              <w:t xml:space="preserve">Rotular cada conector y cada bornera antes de cerrar el gabinete (J1, J2, J3; B1 Marcha, Pausa y Retroceder; B2; B3 canal 1 a 4). Si el Nivel 2 se arma en la misma placa principal, J3 no hace falta: los mismos 7 hilos van soldados.</w:t>
+              <w:t xml:space="preserve">Rotular cada conector y cada bornera antes de cerrar el gabinete (J1 a J4; B1 Marcha, Pausa y Retroceder; B2; B3 canal 1 a 4). Si el Nivel 2 se arma en la misma placa principal, J3 no hace falta: los mismos 7 hilos van soldados. Lo mismo con el sensado: armado en la principal, J4 no hace falta.</w:t>
             </w:r>
           </w:p>
         </w:tc>
@@ -2422,7 +2559,7 @@
         <w:keepNext/>
       </w:pPr>
       <w:r>
-        <w:t xml:space="preserve">4.2 Plaqueta 2 · Principal (ESP32 y sensado de la botonera)</w:t>
+        <w:t xml:space="preserve">4.2 Plaqueta 2 · Principal (ESP32)</w:t>
       </w:r>
     </w:p>
     <w:p>
@@ -2476,7 +2613,7 @@
           <w:sz w:val="21"/>
           <w:szCs w:val="21"/>
         </w:rPr>
-        <w:t xml:space="preserve"> junto al ESP32.</w:t>
+        <w:t xml:space="preserve"> junto al ESP32, y el conector J4 hacia la plaqueta de sensado (3,3 V del pin 3V3, GND y GPIO 32, 33 y 34).</w:t>
       </w:r>
     </w:p>
     <w:p>
@@ -2566,151 +2703,25 @@
           <w:sz w:val="21"/>
           <w:szCs w:val="21"/>
         </w:rPr>
-        <w:t xml:space="preserve">Los tres canales de sensado, iguales: el puente </w:t>
-      </w:r>
-      <w:r>
-        <w:rPr>
-          <w:rFonts w:ascii="IBM Plex Sans" w:cs="IBM Plex Sans" w:eastAsia="IBM Plex Sans" w:hAnsi="IBM Plex Sans"/>
-          <w:b/>
-          <w:bCs/>
-          <w:sz w:val="21"/>
-          <w:szCs w:val="21"/>
-        </w:rPr>
-        <w:t xml:space="preserve">DB157</w:t>
-      </w:r>
-      <w:r>
-        <w:rPr>
-          <w:rFonts w:ascii="IBM Plex Sans" w:cs="IBM Plex Sans" w:eastAsia="IBM Plex Sans" w:hAnsi="IBM Plex Sans"/>
-          <w:sz w:val="21"/>
-          <w:szCs w:val="21"/>
-        </w:rPr>
-        <w:t xml:space="preserve"> con sus patas ~ a la bornera del botón; un capacitor de </w:t>
-      </w:r>
-      <w:r>
-        <w:rPr>
-          <w:rFonts w:ascii="IBM Plex Sans" w:cs="IBM Plex Sans" w:eastAsia="IBM Plex Sans" w:hAnsi="IBM Plex Sans"/>
-          <w:b/>
-          <w:bCs/>
-          <w:sz w:val="21"/>
-          <w:szCs w:val="21"/>
-        </w:rPr>
-        <w:t xml:space="preserve">22 µF de 50 V</w:t>
-      </w:r>
-      <w:r>
-        <w:rPr>
-          <w:rFonts w:ascii="IBM Plex Sans" w:cs="IBM Plex Sans" w:eastAsia="IBM Plex Sans" w:hAnsi="IBM Plex Sans"/>
-          <w:sz w:val="21"/>
-          <w:szCs w:val="21"/>
-        </w:rPr>
-        <w:t xml:space="preserve"> entre el + y el − del puente (pata larga al +; la botonera rectificada llega a unos 34 V de pico); </w:t>
-      </w:r>
-      <w:r>
-        <w:rPr>
-          <w:rFonts w:ascii="IBM Plex Sans" w:cs="IBM Plex Sans" w:eastAsia="IBM Plex Sans" w:hAnsi="IBM Plex Sans"/>
-          <w:b/>
-          <w:bCs/>
-          <w:sz w:val="21"/>
-          <w:szCs w:val="21"/>
-        </w:rPr>
-        <w:t xml:space="preserve">2,2 kΩ 1 W</w:t>
-      </w:r>
-      <w:r>
-        <w:rPr>
-          <w:rFonts w:ascii="IBM Plex Sans" w:cs="IBM Plex Sans" w:eastAsia="IBM Plex Sans" w:hAnsi="IBM Plex Sans"/>
-          <w:sz w:val="21"/>
-          <w:szCs w:val="21"/>
-        </w:rPr>
-        <w:t xml:space="preserve"> del + del puente a la pata 1 del </w:t>
-      </w:r>
-      <w:r>
-        <w:rPr>
-          <w:rFonts w:ascii="IBM Plex Sans" w:cs="IBM Plex Sans" w:eastAsia="IBM Plex Sans" w:hAnsi="IBM Plex Sans"/>
-          <w:b/>
-          <w:bCs/>
-          <w:sz w:val="21"/>
-          <w:szCs w:val="21"/>
-        </w:rPr>
-        <w:t xml:space="preserve">PC817</w:t>
-      </w:r>
-      <w:r>
-        <w:rPr>
-          <w:rFonts w:ascii="IBM Plex Sans" w:cs="IBM Plex Sans" w:eastAsia="IBM Plex Sans" w:hAnsi="IBM Plex Sans"/>
-          <w:sz w:val="21"/>
-          <w:szCs w:val="21"/>
-        </w:rPr>
-        <w:t xml:space="preserve">; el − del puente a la pata 2; la pata 3 al GND del ESP32; la pata 4 al GPIO, con </w:t>
-      </w:r>
-      <w:r>
-        <w:rPr>
-          <w:rFonts w:ascii="IBM Plex Sans" w:cs="IBM Plex Sans" w:eastAsia="IBM Plex Sans" w:hAnsi="IBM Plex Sans"/>
-          <w:b/>
-          <w:bCs/>
-          <w:sz w:val="21"/>
-          <w:szCs w:val="21"/>
-        </w:rPr>
-        <w:t xml:space="preserve">10 kΩ a 3,3 V</w:t>
-      </w:r>
-      <w:r>
-        <w:rPr>
-          <w:rFonts w:ascii="IBM Plex Sans" w:cs="IBM Plex Sans" w:eastAsia="IBM Plex Sans" w:hAnsi="IBM Plex Sans"/>
-          <w:sz w:val="21"/>
-          <w:szCs w:val="21"/>
-        </w:rPr>
-        <w:t xml:space="preserve">: GPIO </w:t>
-      </w:r>
-      <w:r>
-        <w:rPr>
-          <w:rFonts w:ascii="IBM Plex Sans" w:cs="IBM Plex Sans" w:eastAsia="IBM Plex Sans" w:hAnsi="IBM Plex Sans"/>
-          <w:b/>
-          <w:bCs/>
-          <w:sz w:val="21"/>
-          <w:szCs w:val="21"/>
-        </w:rPr>
-        <w:t xml:space="preserve">32</w:t>
-      </w:r>
-      <w:r>
-        <w:rPr>
-          <w:rFonts w:ascii="IBM Plex Sans" w:cs="IBM Plex Sans" w:eastAsia="IBM Plex Sans" w:hAnsi="IBM Plex Sans"/>
-          <w:sz w:val="21"/>
-          <w:szCs w:val="21"/>
-        </w:rPr>
-        <w:t xml:space="preserve"> Marcha, </w:t>
-      </w:r>
-      <w:r>
-        <w:rPr>
-          <w:rFonts w:ascii="IBM Plex Sans" w:cs="IBM Plex Sans" w:eastAsia="IBM Plex Sans" w:hAnsi="IBM Plex Sans"/>
-          <w:b/>
-          <w:bCs/>
-          <w:sz w:val="21"/>
-          <w:szCs w:val="21"/>
-        </w:rPr>
-        <w:t xml:space="preserve">33</w:t>
-      </w:r>
-      <w:r>
-        <w:rPr>
-          <w:rFonts w:ascii="IBM Plex Sans" w:cs="IBM Plex Sans" w:eastAsia="IBM Plex Sans" w:hAnsi="IBM Plex Sans"/>
-          <w:sz w:val="21"/>
-          <w:szCs w:val="21"/>
-        </w:rPr>
-        <w:t xml:space="preserve"> Pausa, </w:t>
-      </w:r>
-      <w:r>
-        <w:rPr>
-          <w:rFonts w:ascii="IBM Plex Sans" w:cs="IBM Plex Sans" w:eastAsia="IBM Plex Sans" w:hAnsi="IBM Plex Sans"/>
-          <w:b/>
-          <w:bCs/>
-          <w:sz w:val="21"/>
-          <w:szCs w:val="21"/>
-        </w:rPr>
-        <w:t xml:space="preserve">34</w:t>
-      </w:r>
-      <w:r>
-        <w:rPr>
-          <w:rFonts w:ascii="IBM Plex Sans" w:cs="IBM Plex Sans" w:eastAsia="IBM Plex Sans" w:hAnsi="IBM Plex Sans"/>
-          <w:sz w:val="21"/>
-          <w:szCs w:val="21"/>
-        </w:rPr>
-        <w:t xml:space="preserve"> Retroceder.</w:t>
+        <w:t xml:space="preserve">Sin alimentar, con el multímetro en continuidad: entre +5 V y GND </w:t>
+      </w:r>
+      <w:r>
+        <w:rPr>
+          <w:rFonts w:ascii="IBM Plex Sans" w:cs="IBM Plex Sans" w:eastAsia="IBM Plex Sans" w:hAnsi="IBM Plex Sans"/>
+          <w:b/>
+          <w:bCs/>
+          <w:sz w:val="21"/>
+          <w:szCs w:val="21"/>
+        </w:rPr>
+        <w:t xml:space="preserve">no tiene que pitar</w:t>
+      </w:r>
+      <w:r>
+        <w:rPr>
+          <w:rFonts w:ascii="IBM Plex Sans" w:cs="IBM Plex Sans" w:eastAsia="IBM Plex Sans" w:hAnsi="IBM Plex Sans"/>
+          <w:sz w:val="21"/>
+          <w:szCs w:val="21"/>
+        </w:rPr>
+        <w:t xml:space="preserve"> (un pitido corto al principio es normal: es el capacitor de 470 µF que se carga; si pita sin parar, hay un corto).</w:t>
       </w:r>
     </w:p>
     <w:p>
@@ -2728,25 +2739,65 @@
           <w:sz w:val="21"/>
           <w:szCs w:val="21"/>
         </w:rPr>
-        <w:t xml:space="preserve">Sin alimentar, con el multímetro en continuidad: entre el GND del ESP32 y cualquier borne de la botonera </w:t>
-      </w:r>
-      <w:r>
-        <w:rPr>
-          <w:rFonts w:ascii="IBM Plex Sans" w:cs="IBM Plex Sans" w:eastAsia="IBM Plex Sans" w:hAnsi="IBM Plex Sans"/>
-          <w:b/>
-          <w:bCs/>
-          <w:sz w:val="21"/>
-          <w:szCs w:val="21"/>
-        </w:rPr>
-        <w:t xml:space="preserve">no tiene que pitar</w:t>
-      </w:r>
-      <w:r>
-        <w:rPr>
-          <w:rFonts w:ascii="IBM Plex Sans" w:cs="IBM Plex Sans" w:eastAsia="IBM Plex Sans" w:hAnsi="IBM Plex Sans"/>
-          <w:sz w:val="21"/>
-          <w:szCs w:val="21"/>
-        </w:rPr>
-        <w:t xml:space="preserve">; entre +5 V y GND tampoco (un pitido corto al principio es normal: es el capacitor de 470 µF que se carga; si pita sin parar, hay un corto).</w:t>
+        <w:t xml:space="preserve">Conectar J1 a la fuente, enchufar y medir </w:t>
+      </w:r>
+      <w:r>
+        <w:rPr>
+          <w:rFonts w:ascii="IBM Plex Sans" w:cs="IBM Plex Sans" w:eastAsia="IBM Plex Sans" w:hAnsi="IBM Plex Sans"/>
+          <w:b/>
+          <w:bCs/>
+          <w:sz w:val="21"/>
+          <w:szCs w:val="21"/>
+        </w:rPr>
+        <w:t xml:space="preserve">5 V</w:t>
+      </w:r>
+      <w:r>
+        <w:rPr>
+          <w:rFonts w:ascii="IBM Plex Sans" w:cs="IBM Plex Sans" w:eastAsia="IBM Plex Sans" w:hAnsi="IBM Plex Sans"/>
+          <w:sz w:val="21"/>
+          <w:szCs w:val="21"/>
+        </w:rPr>
+        <w:t xml:space="preserve"> entre los pines VIN y GND de la tira. Desenchufar, poner el ESP32 (orientado según la serigrafía) y volver a medir: </w:t>
+      </w:r>
+      <w:r>
+        <w:rPr>
+          <w:rFonts w:ascii="IBM Plex Sans" w:cs="IBM Plex Sans" w:eastAsia="IBM Plex Sans" w:hAnsi="IBM Plex Sans"/>
+          <w:b/>
+          <w:bCs/>
+          <w:sz w:val="21"/>
+          <w:szCs w:val="21"/>
+        </w:rPr>
+        <w:t xml:space="preserve">3,3 V</w:t>
+      </w:r>
+      <w:r>
+        <w:rPr>
+          <w:rFonts w:ascii="IBM Plex Sans" w:cs="IBM Plex Sans" w:eastAsia="IBM Plex Sans" w:hAnsi="IBM Plex Sans"/>
+          <w:sz w:val="21"/>
+          <w:szCs w:val="21"/>
+        </w:rPr>
+        <w:t xml:space="preserve"> en el pin 3V3.</w:t>
+      </w:r>
+    </w:p>
+    <w:p>
+      <w:pPr>
+        <w:pStyle w:val="Heading2"/>
+        <w:keepNext/>
+      </w:pPr>
+      <w:r>
+        <w:t xml:space="preserve">4.3 Plaqueta 5 · Sensado de la botonera</w:t>
+      </w:r>
+    </w:p>
+    <w:p>
+      <w:pPr>
+        <w:spacing w:after="120" w:line="290"/>
+      </w:pPr>
+      <w:r>
+        <w:rPr>
+          <w:rFonts w:ascii="IBM Plex Sans" w:cs="IBM Plex Sans" w:eastAsia="IBM Plex Sans" w:hAnsi="IBM Plex Sans"/>
+          <w:sz w:val="21"/>
+          <w:szCs w:val="21"/>
+        </w:rPr>
+        <w:t xml:space="preserve">Es una plaqueta impresa aparte, unida a la principal por J4.</w:t>
       </w:r>
     </w:p>
     <w:p>
@@ -2754,7 +2805,7 @@
         <w:pStyle w:val="ListParagraph"/>
         <w:numPr>
           <w:ilvl w:val="0"/>
-          <w:numId w:val="4"/>
+          <w:numId w:val="17"/>
         </w:numPr>
         <w:spacing w:after="90" w:line="290"/>
       </w:pPr>
@@ -2764,43 +2815,313 @@
           <w:sz w:val="21"/>
           <w:szCs w:val="21"/>
         </w:rPr>
-        <w:t xml:space="preserve">Conectar J1 a la fuente, enchufar y medir </w:t>
-      </w:r>
-      <w:r>
-        <w:rPr>
-          <w:rFonts w:ascii="IBM Plex Sans" w:cs="IBM Plex Sans" w:eastAsia="IBM Plex Sans" w:hAnsi="IBM Plex Sans"/>
-          <w:b/>
-          <w:bCs/>
-          <w:sz w:val="21"/>
-          <w:szCs w:val="21"/>
-        </w:rPr>
-        <w:t xml:space="preserve">5 V</w:t>
-      </w:r>
-      <w:r>
-        <w:rPr>
-          <w:rFonts w:ascii="IBM Plex Sans" w:cs="IBM Plex Sans" w:eastAsia="IBM Plex Sans" w:hAnsi="IBM Plex Sans"/>
-          <w:sz w:val="21"/>
-          <w:szCs w:val="21"/>
-        </w:rPr>
-        <w:t xml:space="preserve"> entre los pines VIN y GND de la tira. Desenchufar, poner el ESP32 (orientado según la serigrafía) y volver a medir: </w:t>
-      </w:r>
-      <w:r>
-        <w:rPr>
-          <w:rFonts w:ascii="IBM Plex Sans" w:cs="IBM Plex Sans" w:eastAsia="IBM Plex Sans" w:hAnsi="IBM Plex Sans"/>
-          <w:b/>
-          <w:bCs/>
-          <w:sz w:val="21"/>
-          <w:szCs w:val="21"/>
-        </w:rPr>
-        <w:t xml:space="preserve">3,3 V</w:t>
-      </w:r>
-      <w:r>
-        <w:rPr>
-          <w:rFonts w:ascii="IBM Plex Sans" w:cs="IBM Plex Sans" w:eastAsia="IBM Plex Sans" w:hAnsi="IBM Plex Sans"/>
-          <w:sz w:val="21"/>
-          <w:szCs w:val="21"/>
-        </w:rPr>
-        <w:t xml:space="preserve"> en el pin 3V3.</w:t>
+        <w:t xml:space="preserve">Por canal, los tres iguales: el puente </w:t>
+      </w:r>
+      <w:r>
+        <w:rPr>
+          <w:rFonts w:ascii="IBM Plex Sans" w:cs="IBM Plex Sans" w:eastAsia="IBM Plex Sans" w:hAnsi="IBM Plex Sans"/>
+          <w:b/>
+          <w:bCs/>
+          <w:sz w:val="21"/>
+          <w:szCs w:val="21"/>
+        </w:rPr>
+        <w:t xml:space="preserve">DB157</w:t>
+      </w:r>
+      <w:r>
+        <w:rPr>
+          <w:rFonts w:ascii="IBM Plex Sans" w:cs="IBM Plex Sans" w:eastAsia="IBM Plex Sans" w:hAnsi="IBM Plex Sans"/>
+          <w:sz w:val="21"/>
+          <w:szCs w:val="21"/>
+        </w:rPr>
+        <w:t xml:space="preserve"> con sus patas ~ a la bornera B1 del botón; un capacitor de </w:t>
+      </w:r>
+      <w:r>
+        <w:rPr>
+          <w:rFonts w:ascii="IBM Plex Sans" w:cs="IBM Plex Sans" w:eastAsia="IBM Plex Sans" w:hAnsi="IBM Plex Sans"/>
+          <w:b/>
+          <w:bCs/>
+          <w:sz w:val="21"/>
+          <w:szCs w:val="21"/>
+        </w:rPr>
+        <w:t xml:space="preserve">22 µF de 50 V</w:t>
+      </w:r>
+      <w:r>
+        <w:rPr>
+          <w:rFonts w:ascii="IBM Plex Sans" w:cs="IBM Plex Sans" w:eastAsia="IBM Plex Sans" w:hAnsi="IBM Plex Sans"/>
+          <w:sz w:val="21"/>
+          <w:szCs w:val="21"/>
+        </w:rPr>
+        <w:t xml:space="preserve"> entre el + y el − del puente (pata larga al +; la botonera rectificada llega a unos 34 V de pico); </w:t>
+      </w:r>
+      <w:r>
+        <w:rPr>
+          <w:rFonts w:ascii="IBM Plex Sans" w:cs="IBM Plex Sans" w:eastAsia="IBM Plex Sans" w:hAnsi="IBM Plex Sans"/>
+          <w:b/>
+          <w:bCs/>
+          <w:sz w:val="21"/>
+          <w:szCs w:val="21"/>
+        </w:rPr>
+        <w:t xml:space="preserve">2,2 kΩ 1 W</w:t>
+      </w:r>
+      <w:r>
+        <w:rPr>
+          <w:rFonts w:ascii="IBM Plex Sans" w:cs="IBM Plex Sans" w:eastAsia="IBM Plex Sans" w:hAnsi="IBM Plex Sans"/>
+          <w:sz w:val="21"/>
+          <w:szCs w:val="21"/>
+        </w:rPr>
+        <w:t xml:space="preserve"> del + del puente a la pata 1 del </w:t>
+      </w:r>
+      <w:r>
+        <w:rPr>
+          <w:rFonts w:ascii="IBM Plex Sans" w:cs="IBM Plex Sans" w:eastAsia="IBM Plex Sans" w:hAnsi="IBM Plex Sans"/>
+          <w:b/>
+          <w:bCs/>
+          <w:sz w:val="21"/>
+          <w:szCs w:val="21"/>
+        </w:rPr>
+        <w:t xml:space="preserve">PC817</w:t>
+      </w:r>
+      <w:r>
+        <w:rPr>
+          <w:rFonts w:ascii="IBM Plex Sans" w:cs="IBM Plex Sans" w:eastAsia="IBM Plex Sans" w:hAnsi="IBM Plex Sans"/>
+          <w:sz w:val="21"/>
+          <w:szCs w:val="21"/>
+        </w:rPr>
+        <w:t xml:space="preserve">; el − del puente a la pata 2; la pata 3 al GND de J4; la pata 4 al GPIO de J4, con </w:t>
+      </w:r>
+      <w:r>
+        <w:rPr>
+          <w:rFonts w:ascii="IBM Plex Sans" w:cs="IBM Plex Sans" w:eastAsia="IBM Plex Sans" w:hAnsi="IBM Plex Sans"/>
+          <w:b/>
+          <w:bCs/>
+          <w:sz w:val="21"/>
+          <w:szCs w:val="21"/>
+        </w:rPr>
+        <w:t xml:space="preserve">10 kΩ a 3,3 V</w:t>
+      </w:r>
+      <w:r>
+        <w:rPr>
+          <w:rFonts w:ascii="IBM Plex Sans" w:cs="IBM Plex Sans" w:eastAsia="IBM Plex Sans" w:hAnsi="IBM Plex Sans"/>
+          <w:sz w:val="21"/>
+          <w:szCs w:val="21"/>
+        </w:rPr>
+        <w:t xml:space="preserve">: GPIO </w:t>
+      </w:r>
+      <w:r>
+        <w:rPr>
+          <w:rFonts w:ascii="IBM Plex Sans" w:cs="IBM Plex Sans" w:eastAsia="IBM Plex Sans" w:hAnsi="IBM Plex Sans"/>
+          <w:b/>
+          <w:bCs/>
+          <w:sz w:val="21"/>
+          <w:szCs w:val="21"/>
+        </w:rPr>
+        <w:t xml:space="preserve">32</w:t>
+      </w:r>
+      <w:r>
+        <w:rPr>
+          <w:rFonts w:ascii="IBM Plex Sans" w:cs="IBM Plex Sans" w:eastAsia="IBM Plex Sans" w:hAnsi="IBM Plex Sans"/>
+          <w:sz w:val="21"/>
+          <w:szCs w:val="21"/>
+        </w:rPr>
+        <w:t xml:space="preserve"> Marcha, </w:t>
+      </w:r>
+      <w:r>
+        <w:rPr>
+          <w:rFonts w:ascii="IBM Plex Sans" w:cs="IBM Plex Sans" w:eastAsia="IBM Plex Sans" w:hAnsi="IBM Plex Sans"/>
+          <w:b/>
+          <w:bCs/>
+          <w:sz w:val="21"/>
+          <w:szCs w:val="21"/>
+        </w:rPr>
+        <w:t xml:space="preserve">33</w:t>
+      </w:r>
+      <w:r>
+        <w:rPr>
+          <w:rFonts w:ascii="IBM Plex Sans" w:cs="IBM Plex Sans" w:eastAsia="IBM Plex Sans" w:hAnsi="IBM Plex Sans"/>
+          <w:sz w:val="21"/>
+          <w:szCs w:val="21"/>
+        </w:rPr>
+        <w:t xml:space="preserve"> Pausa, </w:t>
+      </w:r>
+      <w:r>
+        <w:rPr>
+          <w:rFonts w:ascii="IBM Plex Sans" w:cs="IBM Plex Sans" w:eastAsia="IBM Plex Sans" w:hAnsi="IBM Plex Sans"/>
+          <w:b/>
+          <w:bCs/>
+          <w:sz w:val="21"/>
+          <w:szCs w:val="21"/>
+        </w:rPr>
+        <w:t xml:space="preserve">34</w:t>
+      </w:r>
+      <w:r>
+        <w:rPr>
+          <w:rFonts w:ascii="IBM Plex Sans" w:cs="IBM Plex Sans" w:eastAsia="IBM Plex Sans" w:hAnsi="IBM Plex Sans"/>
+          <w:sz w:val="21"/>
+          <w:szCs w:val="21"/>
+        </w:rPr>
+        <w:t xml:space="preserve"> Retroceder.</w:t>
+      </w:r>
+    </w:p>
+    <w:p>
+      <w:pPr>
+        <w:pStyle w:val="ListParagraph"/>
+        <w:numPr>
+          <w:ilvl w:val="0"/>
+          <w:numId w:val="17"/>
+        </w:numPr>
+        <w:spacing w:after="90" w:line="290"/>
+      </w:pPr>
+      <w:r>
+        <w:rPr>
+          <w:rFonts w:ascii="IBM Plex Sans" w:cs="IBM Plex Sans" w:eastAsia="IBM Plex Sans" w:hAnsi="IBM Plex Sans"/>
+          <w:sz w:val="21"/>
+          <w:szCs w:val="21"/>
+        </w:rPr>
+        <w:t xml:space="preserve">Bornera </w:t>
+      </w:r>
+      <w:r>
+        <w:rPr>
+          <w:rFonts w:ascii="IBM Plex Sans" w:cs="IBM Plex Sans" w:eastAsia="IBM Plex Sans" w:hAnsi="IBM Plex Sans"/>
+          <w:b/>
+          <w:bCs/>
+          <w:sz w:val="21"/>
+          <w:szCs w:val="21"/>
+        </w:rPr>
+        <w:t xml:space="preserve">B1</w:t>
+      </w:r>
+      <w:r>
+        <w:rPr>
+          <w:rFonts w:ascii="IBM Plex Sans" w:cs="IBM Plex Sans" w:eastAsia="IBM Plex Sans" w:hAnsi="IBM Plex Sans"/>
+          <w:sz w:val="21"/>
+          <w:szCs w:val="21"/>
+        </w:rPr>
+        <w:t xml:space="preserve"> doble por botón: un par para el cable de la botonera y otro para el cable que va a </w:t>
+      </w:r>
+      <w:r>
+        <w:rPr>
+          <w:rFonts w:ascii="IBM Plex Sans" w:cs="IBM Plex Sans" w:eastAsia="IBM Plex Sans" w:hAnsi="IBM Plex Sans"/>
+          <w:b/>
+          <w:bCs/>
+          <w:sz w:val="21"/>
+          <w:szCs w:val="21"/>
+        </w:rPr>
+        <w:t xml:space="preserve">NO y COM de su relé</w:t>
+      </w:r>
+      <w:r>
+        <w:rPr>
+          <w:rFonts w:ascii="IBM Plex Sans" w:cs="IBM Plex Sans" w:eastAsia="IBM Plex Sans" w:hAnsi="IBM Plex Sans"/>
+          <w:sz w:val="21"/>
+          <w:szCs w:val="21"/>
+        </w:rPr>
+        <w:t xml:space="preserve"> (plaqueta 3), los dos unidos en la plaqueta a las patas ~ del puente.</w:t>
+      </w:r>
+    </w:p>
+    <w:p>
+      <w:pPr>
+        <w:pStyle w:val="ListParagraph"/>
+        <w:numPr>
+          <w:ilvl w:val="0"/>
+          <w:numId w:val="17"/>
+        </w:numPr>
+        <w:spacing w:after="90" w:line="290"/>
+      </w:pPr>
+      <w:r>
+        <w:rPr>
+          <w:rFonts w:ascii="IBM Plex Sans" w:cs="IBM Plex Sans" w:eastAsia="IBM Plex Sans" w:hAnsi="IBM Plex Sans"/>
+          <w:sz w:val="21"/>
+          <w:szCs w:val="21"/>
+        </w:rPr>
+        <w:t xml:space="preserve">Conector </w:t>
+      </w:r>
+      <w:r>
+        <w:rPr>
+          <w:rFonts w:ascii="IBM Plex Sans" w:cs="IBM Plex Sans" w:eastAsia="IBM Plex Sans" w:hAnsi="IBM Plex Sans"/>
+          <w:b/>
+          <w:bCs/>
+          <w:sz w:val="21"/>
+          <w:szCs w:val="21"/>
+        </w:rPr>
+        <w:t xml:space="preserve">J4</w:t>
+      </w:r>
+      <w:r>
+        <w:rPr>
+          <w:rFonts w:ascii="IBM Plex Sans" w:cs="IBM Plex Sans" w:eastAsia="IBM Plex Sans" w:hAnsi="IBM Plex Sans"/>
+          <w:sz w:val="21"/>
+          <w:szCs w:val="21"/>
+        </w:rPr>
+        <w:t xml:space="preserve"> a la principal, 5 hilos: 3,3 V (del pin 3V3 del ESP32), GND y GPIO 32, 33 y 34.</w:t>
+      </w:r>
+    </w:p>
+    <w:p>
+      <w:pPr>
+        <w:pStyle w:val="ListParagraph"/>
+        <w:numPr>
+          <w:ilvl w:val="0"/>
+          <w:numId w:val="17"/>
+        </w:numPr>
+        <w:spacing w:after="90" w:line="290"/>
+      </w:pPr>
+      <w:r>
+        <w:rPr>
+          <w:rFonts w:ascii="IBM Plex Sans" w:cs="IBM Plex Sans" w:eastAsia="IBM Plex Sans" w:hAnsi="IBM Plex Sans"/>
+          <w:sz w:val="21"/>
+          <w:szCs w:val="21"/>
+        </w:rPr>
+        <w:t xml:space="preserve">Lo de 24 V (B1, puentes, capacitores, 2,2 kΩ y las patas 1 y 2 de cada PC817) de un lado, y lo del ESP32 (patas 3 y 4, las 10 kΩ y J4) del otro, </w:t>
+      </w:r>
+      <w:r>
+        <w:rPr>
+          <w:rFonts w:ascii="IBM Plex Sans" w:cs="IBM Plex Sans" w:eastAsia="IBM Plex Sans" w:hAnsi="IBM Plex Sans"/>
+          <w:b/>
+          <w:bCs/>
+          <w:sz w:val="21"/>
+          <w:szCs w:val="21"/>
+        </w:rPr>
+        <w:t xml:space="preserve">sin pistas por debajo de los PC817</w:t>
+      </w:r>
+      <w:r>
+        <w:rPr>
+          <w:rFonts w:ascii="IBM Plex Sans" w:cs="IBM Plex Sans" w:eastAsia="IBM Plex Sans" w:hAnsi="IBM Plex Sans"/>
+          <w:sz w:val="21"/>
+          <w:szCs w:val="21"/>
+        </w:rPr>
+        <w:t xml:space="preserve">. Marcar a mano el + de cada capacitor y la pata 1 de cada PC817 y puente: en la plaqueta impresa no sale la serigrafía. Un capacitor invertido puede quedar en corto, y un canal en corto es como dejar el botón apretado.</w:t>
+      </w:r>
+    </w:p>
+    <w:p>
+      <w:pPr>
+        <w:pStyle w:val="ListParagraph"/>
+        <w:numPr>
+          <w:ilvl w:val="0"/>
+          <w:numId w:val="17"/>
+        </w:numPr>
+        <w:spacing w:after="90" w:line="290"/>
+      </w:pPr>
+      <w:r>
+        <w:rPr>
+          <w:rFonts w:ascii="IBM Plex Sans" w:cs="IBM Plex Sans" w:eastAsia="IBM Plex Sans" w:hAnsi="IBM Plex Sans"/>
+          <w:sz w:val="21"/>
+          <w:szCs w:val="21"/>
+        </w:rPr>
+        <w:t xml:space="preserve">Sin alimentar, con el multímetro en continuidad: entre cualquier borne de B1 y cualquier pin de J4 </w:t>
+      </w:r>
+      <w:r>
+        <w:rPr>
+          <w:rFonts w:ascii="IBM Plex Sans" w:cs="IBM Plex Sans" w:eastAsia="IBM Plex Sans" w:hAnsi="IBM Plex Sans"/>
+          <w:b/>
+          <w:bCs/>
+          <w:sz w:val="21"/>
+          <w:szCs w:val="21"/>
+        </w:rPr>
+        <w:t xml:space="preserve">no tiene que pitar</w:t>
+      </w:r>
+      <w:r>
+        <w:rPr>
+          <w:rFonts w:ascii="IBM Plex Sans" w:cs="IBM Plex Sans" w:eastAsia="IBM Plex Sans" w:hAnsi="IBM Plex Sans"/>
+          <w:sz w:val="21"/>
+          <w:szCs w:val="21"/>
+        </w:rPr>
+        <w:t xml:space="preserve">.</w:t>
       </w:r>
     </w:p>
     <w:p>
@@ -2809,7 +3130,7 @@
         <w:keepNext/>
       </w:pPr>
       <w:r>
-        <w:t xml:space="preserve">4.3 Plaqueta 3 · Módulos de relé</w:t>
+        <w:t xml:space="preserve">4.4 Plaqueta 3 · Módulos de relé</w:t>
       </w:r>
     </w:p>
     <w:p>
@@ -2953,7 +3274,7 @@
           <w:sz w:val="21"/>
           <w:szCs w:val="21"/>
         </w:rPr>
-        <w:t xml:space="preserve"> de los tres relés quedan para la bornera B1. Todavía no se conectan al telar.</w:t>
+        <w:t xml:space="preserve"> de cada relé, al par de su bornera B1 en la plaqueta de sensado. La botonera todavía no se conecta.</w:t>
       </w:r>
     </w:p>
     <w:p>
@@ -2962,7 +3283,7 @@
         <w:keepNext/>
       </w:pPr>
       <w:r>
-        <w:t xml:space="preserve">4.4 Plaqueta 4 · Nivel 2 (cuando se arme)</w:t>
+        <w:t xml:space="preserve">4.5 Plaqueta 4 · Nivel 2 (cuando se arme)</w:t>
       </w:r>
     </w:p>
     <w:p>
@@ -5389,7 +5710,7 @@
           <w:sz w:val="21"/>
           <w:szCs w:val="21"/>
         </w:rPr>
-        <w:t xml:space="preserve">Las plaquetas conectadas entre sí (J1, J2 y J3) y alimentadas con la fuente; el ESP32 con el firmware, ya sin el USB.</w:t>
+        <w:t xml:space="preserve">Las plaquetas conectadas entre sí (J1 a J4) y alimentadas con la fuente; el ESP32 con el firmware, ya sin el USB.</w:t>
       </w:r>
     </w:p>
     <w:p>
@@ -5785,7 +6106,7 @@
           <w:sz w:val="21"/>
           <w:szCs w:val="21"/>
         </w:rPr>
-        <w:t xml:space="preserve">En B1, cada par va a </w:t>
+        <w:t xml:space="preserve">En la plaqueta de sensado, cada bornera B1 lleva el par de su botón a </w:t>
       </w:r>
       <w:r>
         <w:rPr>
@@ -5803,7 +6124,7 @@
           <w:sz w:val="21"/>
           <w:szCs w:val="21"/>
         </w:rPr>
-        <w:t xml:space="preserve"> (en paralelo con el botón) y a la </w:t>
+        <w:t xml:space="preserve"> (en paralelo con el botón), por su otro par, y a la </w:t>
       </w:r>
       <w:r>
         <w:rPr>
@@ -9568,6 +9889,12 @@
   </w:num>
   <w:num w:numId="16">
     <w:abstractNumId w:val="16"/>
+    <w:lvlOverride w:ilvl="0">
+      <w:startOverride w:val="1"/>
+    </w:lvlOverride>
+  </w:num>
+  <w:num w:numId="17">
+    <w:abstractNumId w:val="4"/>
     <w:lvlOverride w:ilvl="0">
       <w:startOverride w:val="1"/>
     </w:lvlOverride>

</xml_diff>

<commit_message>
Revisión, vuelta 5: solo sensado en las guías y en las verificaciones
- Guía de conexión (Markdown): la nota de «Control desde la página»
  que ya tenía el Word; en las dos, las pruebas de relés aclaran que
  el control tiene que estar prendido.
- Guía de mediciones (Word y PDF): verificación 21, solo sensado.
- AVISO de la app Android: el 409 de solo sensado.

Co-Authored-By: Claude Opus 5.5 <noreply@anthropic.com>
Claude-Session: https://claude.ai/code/session_01QiY8ZZNAM9gwPKiqSkCaaj
</commit_message>
<xml_diff>
--- a/documentacion_proyecto/Guia_Conexion_y_Puesta_en_Marcha.docx
+++ b/documentacion_proyecto/Guia_Conexion_y_Puesta_en_Marcha.docx
@@ -5782,7 +5782,7 @@
           <w:sz w:val="21"/>
           <w:szCs w:val="21"/>
         </w:rPr>
-        <w:t xml:space="preserve">En la web, abrir un dibujo y tocar </w:t>
+        <w:t xml:space="preserve">En la web, con «Control desde la página» prendido, abrir un dibujo y tocar </w:t>
       </w:r>
       <w:r>
         <w:rPr>
@@ -6231,7 +6231,7 @@
           <w:sz w:val="21"/>
           <w:szCs w:val="21"/>
         </w:rPr>
-        <w:t xml:space="preserve">Encender el gabinete. Desde la web: ▶ arranca la máquina, ⏸ la pausa y ⏪ la hace retroceder una pasada. Con alguien al lado del botón Stop del telar.</w:t>
+        <w:t xml:space="preserve">Encender el gabinete. Desde la web, con «Control desde la página» prendido: ▶ arranca la máquina, ⏸ la pausa y ⏪ la hace retroceder una pasada. Con alguien al lado del botón Stop del telar.</w:t>
       </w:r>
     </w:p>
     <w:p>

</xml_diff>